<commit_message>
Doctor entry beside page actions; flexible per-segment episode counts
- demo/doctor.html: the 剧本医生 button now sits in the document header
  next to 导出 / 续写.
- demo/cards.html: the card-point dialog sets each segment's episode
  count freely (0 skips it); draggable stacked strip, steppers, presets,
  short-segment warning, credits for active segments only, and a
  workspace that only generates the non-empty segments with 启用 later.
- PRD-home-doctor v1.1 documents both.

Co-Authored-By: Claude Opus 5.5 <noreply@anthropic.com>
Claude-Session: https://claude.ai/code/session_01BwGpqARRukchuVN39hPaRP
</commit_message>
<xml_diff>
--- a/docs/PRD-home-doctor.docx
+++ b/docs/PRD-home-doctor.docx
@@ -28,13 +28,13 @@
         </w:p>
       </w:sdtContent>
     </w:sdt>
-    <w:bookmarkStart w:id="110" w:name="澜幕-首页上传与技能栏-剧本医生可视化prd"/>
+    <w:bookmarkStart w:id="141" w:name="澜幕-首页上传与技能栏-剧本医生可视化-卡点分段-prd"/>
     <w:p>
       <w:pPr>
         <w:pStyle w:val="Heading1"/>
       </w:pPr>
       <w:r>
-        <w:t xml:space="preserve">澜幕 · 首页上传与技能栏 / 剧本医生（可视化）PRD</w:t>
+        <w:t xml:space="preserve">澜幕 · 首页上传与技能栏 / 剧本医生（可视化）/ 卡点分段 PRD</w:t>
       </w:r>
     </w:p>
     <w:tbl>
@@ -98,7 +98,7 @@
               <w:jc w:val="left"/>
             </w:pPr>
             <w:r>
-              <w:t xml:space="preserve">v1.0（评审稿）</w:t>
+              <w:t xml:space="preserve">v1.1（评审稿）</w:t>
             </w:r>
           </w:p>
         </w:tc>
@@ -160,7 +160,50 @@
               <w:t xml:space="preserve">或剧本</w:t>
             </w:r>
             <w:r>
-              <w:t xml:space="preserve">（自动识别）＋ 技能选项栏（@ 添加技能）；② 生成页：剧本医生入口放到右上角，报告改为可视化</w:t>
+              <w:t xml:space="preserve">（自动识别）＋ 技能选项栏（@ 添加技能）；② 生成页：剧本医生入口放在</w:t>
+            </w:r>
+            <w:r>
+              <w:rPr>
+                <w:bCs/>
+                <w:b/>
+              </w:rPr>
+              <w:t xml:space="preserve">文档标题行右侧</w:t>
+            </w:r>
+            <w:r>
+              <w:t xml:space="preserve">，报告改为可视化；③ 卡点分段：一卡 / 二卡 / 三卡 / 结局段</w:t>
+            </w:r>
+            <w:r>
+              <w:rPr>
+                <w:bCs/>
+                <w:b/>
+              </w:rPr>
+              <w:t xml:space="preserve">每段集数任意，可以是 0</w:t>
+            </w:r>
+          </w:p>
+        </w:tc>
+      </w:tr>
+      <w:tr>
+        <w:tc>
+          <w:tcPr/>
+          <w:p>
+            <w:pPr>
+              <w:pStyle w:val="Compact"/>
+              <w:jc w:val="left"/>
+            </w:pPr>
+            <w:r>
+              <w:t xml:space="preserve">修订</w:t>
+            </w:r>
+          </w:p>
+        </w:tc>
+        <w:tc>
+          <w:tcPr/>
+          <w:p>
+            <w:pPr>
+              <w:pStyle w:val="Compact"/>
+              <w:jc w:val="left"/>
+            </w:pPr>
+            <w:r>
+              <w:t xml:space="preserve">v1.1：剧本医生入口从顶栏移到文档标题行右侧（「导出」「续写」旁）；新增第 4 章卡点分段</w:t>
             </w:r>
           </w:p>
         </w:tc>
@@ -201,7 +244,16 @@
               <w:t xml:space="preserve">demo/doctor.html</w:t>
             </w:r>
             <w:r>
-              <w:t xml:space="preserve">（生成页 · 剧本医生），都可双击打开</w:t>
+              <w:t xml:space="preserve">（生成页 · 剧本医生）、</w:t>
+            </w:r>
+            <w:r>
+              <w:rPr>
+                <w:rStyle w:val="VerbatimChar"/>
+              </w:rPr>
+              <w:t xml:space="preserve">demo/cards.html</w:t>
+            </w:r>
+            <w:r>
+              <w:t xml:space="preserve">（卡点分段），都可双击打开</w:t>
             </w:r>
           </w:p>
         </w:tc>
@@ -3080,13 +3132,13 @@
         <w:t xml:space="preserve">3. 剧本医生（生成页，可视化）</w:t>
       </w:r>
     </w:p>
-    <w:bookmarkStart w:id="68" w:name="入口右上角"/>
+    <w:bookmarkStart w:id="68" w:name="入口文档标题行右侧"/>
     <w:p>
       <w:pPr>
         <w:pStyle w:val="Heading3"/>
       </w:pPr>
       <w:r>
-        <w:t xml:space="preserve">3.1 入口：右上角</w:t>
+        <w:t xml:space="preserve">3.1 入口：文档标题行右侧</w:t>
       </w:r>
     </w:p>
     <w:tbl>
@@ -3150,7 +3202,17 @@
               <w:jc w:val="left"/>
             </w:pPr>
             <w:r>
-              <w:t xml:space="preserve">生成页顶栏右侧、AI 助手图标左边，固定可见</w:t>
+              <w:t xml:space="preserve">每个可体检页面（策划案、集纲、短剧剧本、互动影游剧本）的</w:t>
+            </w:r>
+            <w:r>
+              <w:rPr>
+                <w:bCs/>
+                <w:b/>
+              </w:rPr>
+              <w:t xml:space="preserve">文档标题行右侧</w:t>
+            </w:r>
+            <w:r>
+              <w:t xml:space="preserve">，排在「导出」「续写」等按钮最左边，和页面内容在同一视线上</w:t>
             </w:r>
           </w:p>
         </w:tc>
@@ -3176,7 +3238,7 @@
               <w:jc w:val="left"/>
             </w:pPr>
             <w:r>
-              <w:t xml:space="preserve">青色描边按钮「🩺 剧本医生」+ 右侧分数徽标</w:t>
+              <w:t xml:space="preserve">青色描边按钮「🩺 剧本医生」+ 右侧分数徽标；和同一行的按钮等高</w:t>
             </w:r>
           </w:p>
         </w:tc>
@@ -3321,7 +3383,7 @@
           <wp:inline>
             <wp:extent cx="5334000" cy="3333750"/>
             <wp:effectExtent b="0" l="0" r="0" t="0"/>
-            <wp:docPr descr="右上角入口（未体检）" title="" id="63" name="Picture"/>
+            <wp:docPr descr="入口：文档标题行右侧（未体检）" title="" id="63" name="Picture"/>
             <a:graphic>
               <a:graphicData uri="http://schemas.openxmlformats.org/drawingml/2006/picture">
                 <pic:pic>
@@ -3364,7 +3426,7 @@
         <w:pStyle w:val="ImageCaption"/>
       </w:pPr>
       <w:r>
-        <w:t xml:space="preserve">右上角入口（未体检）</w:t>
+        <w:t xml:space="preserve">入口：文档标题行右侧（未体检）</w:t>
       </w:r>
     </w:p>
     <w:p>
@@ -3376,7 +3438,7 @@
           <wp:inline>
             <wp:extent cx="5334000" cy="3333750"/>
             <wp:effectExtent b="0" l="0" r="0" t="0"/>
-            <wp:docPr descr="体检后：徽标显示分数，AI 助手收起时也一眼可见" title="" id="66" name="Picture"/>
+            <wp:docPr descr="体检后：徽标显示分数" title="" id="66" name="Picture"/>
             <a:graphic>
               <a:graphicData uri="http://schemas.openxmlformats.org/drawingml/2006/picture">
                 <pic:pic>
@@ -3419,7 +3481,7 @@
         <w:pStyle w:val="ImageCaption"/>
       </w:pPr>
       <w:r>
-        <w:t xml:space="preserve">体检后：徽标显示分数，AI 助手收起时也一眼可见</w:t>
+        <w:t xml:space="preserve">体检后：徽标显示分数</w:t>
       </w:r>
     </w:p>
     <w:bookmarkEnd w:id="68"/>
@@ -4718,7 +4780,7 @@
         <w:pStyle w:val="Compact"/>
       </w:pPr>
       <w:r>
-        <w:t xml:space="preserve">正文有改动（采用建议、手动编辑、AI 修改）后，右上角徽标显示「· 已改动」，报告栏按钮变为「内容有改动，重新体检」。</w:t>
+        <w:t xml:space="preserve">正文有改动（采用建议、手动编辑、AI 修改）后，标题行的剧本医生徽标显示「· 已改动」，报告栏按钮变为「内容有改动，重新体检」。</w:t>
       </w:r>
     </w:p>
     <w:p>
@@ -5267,7 +5329,7 @@
               <w:jc w:val="left"/>
             </w:pPr>
             <w:r>
-              <w:t xml:space="preserve">右上角徽标</w:t>
+              <w:t xml:space="preserve">剧本医生徽标</w:t>
             </w:r>
           </w:p>
         </w:tc>
@@ -5512,7 +5574,7 @@
         <w:pStyle w:val="Compact"/>
       </w:pPr>
       <w:r>
-        <w:t xml:space="preserve">生成页右上角始终可见「剧本医生」，未体检显示「未体检」，体检后显示带状态色的分数。</w:t>
+        <w:t xml:space="preserve">可体检页面的文档标题行右侧始终可见「剧本医生」，未体检显示「未体检」，体检后显示带状态色的分数。</w:t>
       </w:r>
     </w:p>
     <w:p>
@@ -5596,7 +5658,1316 @@
     </w:p>
     <w:bookmarkEnd w:id="107"/>
     <w:bookmarkEnd w:id="108"/>
-    <w:bookmarkStart w:id="109" w:name="附录demo-使用说明"/>
+    <w:bookmarkStart w:id="139" w:name="卡点分段每段集数任意"/>
+    <w:p>
+      <w:pPr>
+        <w:pStyle w:val="Heading2"/>
+      </w:pPr>
+      <w:r>
+        <w:t xml:space="preserve">4. 卡点分段：每段集数任意</w:t>
+      </w:r>
+    </w:p>
+    <w:bookmarkStart w:id="109" w:name="要解决的问题"/>
+    <w:p>
+      <w:pPr>
+        <w:pStyle w:val="Heading3"/>
+      </w:pPr>
+      <w:r>
+        <w:t xml:space="preserve">4.1 要解决的问题</w:t>
+      </w:r>
+    </w:p>
+    <w:p>
+      <w:pPr>
+        <w:pStyle w:val="FirstParagraph"/>
+      </w:pPr>
+      <w:r>
+        <w:t xml:space="preserve">原来的卡点弹窗只能拖「卡点落在第几集」，相邻卡点至少隔 3 集，所有段都会生成。用户想要：</w:t>
+      </w:r>
+      <w:r>
+        <w:rPr>
+          <w:bCs/>
+          <w:b/>
+        </w:rPr>
+        <w:t xml:space="preserve">一卡写十几集、二卡写 0 集，就只写一卡</w:t>
+      </w:r>
+      <w:r>
+        <w:t xml:space="preserve">（比如先出一卡给平台试投、或只需要前几集样片）。</w:t>
+      </w:r>
+    </w:p>
+    <w:bookmarkEnd w:id="109"/>
+    <w:bookmarkStart w:id="110" w:name="规则"/>
+    <w:p>
+      <w:pPr>
+        <w:pStyle w:val="Heading3"/>
+      </w:pPr>
+      <w:r>
+        <w:t xml:space="preserve">4.2 规则</w:t>
+      </w:r>
+    </w:p>
+    <w:tbl>
+      <w:tblPr>
+        <w:tblStyle w:val="Table"/>
+        <w:tblW w:type="pct" w:w="5000"/>
+        <w:tblLook w:firstRow="1" w:lastRow="0" w:firstColumn="0" w:lastColumn="0" w:noHBand="0" w:noVBand="0" w:val="0020"/>
+        <w:jc w:val="start"/>
+      </w:tblPr>
+      <w:tblGrid>
+        <w:gridCol w:w="3960"/>
+        <w:gridCol w:w="3960"/>
+      </w:tblGrid>
+      <w:tr>
+        <w:trPr>
+          <w:tblHeader w:val="true"/>
+        </w:trPr>
+        <w:tc>
+          <w:tcPr/>
+          <w:p>
+            <w:pPr>
+              <w:pStyle w:val="Compact"/>
+              <w:jc w:val="left"/>
+            </w:pPr>
+            <w:r>
+              <w:t xml:space="preserve">项</w:t>
+            </w:r>
+          </w:p>
+        </w:tc>
+        <w:tc>
+          <w:tcPr/>
+          <w:p>
+            <w:pPr>
+              <w:pStyle w:val="Compact"/>
+              <w:jc w:val="left"/>
+            </w:pPr>
+            <w:r>
+              <w:t xml:space="preserve">规则</w:t>
+            </w:r>
+          </w:p>
+        </w:tc>
+      </w:tr>
+      <w:tr>
+        <w:tc>
+          <w:tcPr/>
+          <w:p>
+            <w:pPr>
+              <w:pStyle w:val="Compact"/>
+              <w:jc w:val="left"/>
+            </w:pPr>
+            <w:r>
+              <w:t xml:space="preserve">设定对象</w:t>
+            </w:r>
+          </w:p>
+        </w:tc>
+        <w:tc>
+          <w:tcPr/>
+          <w:p>
+            <w:pPr>
+              <w:pStyle w:val="Compact"/>
+              <w:jc w:val="left"/>
+            </w:pPr>
+            <w:r>
+              <w:t xml:space="preserve">改成设定</w:t>
+            </w:r>
+            <w:r>
+              <w:rPr>
+                <w:bCs/>
+                <w:b/>
+              </w:rPr>
+              <w:t xml:space="preserve">每一段的集数</w:t>
+            </w:r>
+            <w:r>
+              <w:t xml:space="preserve">（一卡 / 二卡 / 三卡 / 结局段），不再设定卡点位置</w:t>
+            </w:r>
+          </w:p>
+        </w:tc>
+      </w:tr>
+      <w:tr>
+        <w:tc>
+          <w:tcPr/>
+          <w:p>
+            <w:pPr>
+              <w:pStyle w:val="Compact"/>
+              <w:jc w:val="left"/>
+            </w:pPr>
+            <w:r>
+              <w:t xml:space="preserve">每段范围</w:t>
+            </w:r>
+          </w:p>
+        </w:tc>
+        <w:tc>
+          <w:tcPr/>
+          <w:p>
+            <w:pPr>
+              <w:pStyle w:val="Compact"/>
+              <w:jc w:val="left"/>
+            </w:pPr>
+            <w:r>
+              <w:t xml:space="preserve">0–100 集；</w:t>
+            </w:r>
+            <w:r>
+              <w:rPr>
+                <w:bCs/>
+                <w:b/>
+              </w:rPr>
+              <w:t xml:space="preserve">0 集 = 这一段不生成</w:t>
+            </w:r>
+          </w:p>
+        </w:tc>
+      </w:tr>
+      <w:tr>
+        <w:tc>
+          <w:tcPr/>
+          <w:p>
+            <w:pPr>
+              <w:pStyle w:val="Compact"/>
+              <w:jc w:val="left"/>
+            </w:pPr>
+            <w:r>
+              <w:t xml:space="preserve">总集数</w:t>
+            </w:r>
+          </w:p>
+        </w:tc>
+        <w:tc>
+          <w:tcPr/>
+          <w:p>
+            <w:pPr>
+              <w:pStyle w:val="Compact"/>
+              <w:jc w:val="left"/>
+            </w:pPr>
+            <w:r>
+              <w:t xml:space="preserve">= 各段集数之和，随调整自动变化；上限 150</w:t>
+            </w:r>
+          </w:p>
+        </w:tc>
+      </w:tr>
+      <w:tr>
+        <w:tc>
+          <w:tcPr/>
+          <w:p>
+            <w:pPr>
+              <w:pStyle w:val="Compact"/>
+              <w:jc w:val="left"/>
+            </w:pPr>
+            <w:r>
+              <w:t xml:space="preserve">卡点位置</w:t>
+            </w:r>
+          </w:p>
+        </w:tc>
+        <w:tc>
+          <w:tcPr/>
+          <w:p>
+            <w:pPr>
+              <w:pStyle w:val="Compact"/>
+              <w:jc w:val="left"/>
+            </w:pPr>
+            <w:r>
+              <w:t xml:space="preserve">自动 = 每个非 0 段的最后一集；结局段的最后一集是大结局</w:t>
+            </w:r>
+          </w:p>
+        </w:tc>
+      </w:tr>
+      <w:tr>
+        <w:tc>
+          <w:tcPr/>
+          <w:p>
+            <w:pPr>
+              <w:pStyle w:val="Compact"/>
+              <w:jc w:val="left"/>
+            </w:pPr>
+            <w:r>
+              <w:t xml:space="preserve">至少</w:t>
+            </w:r>
+          </w:p>
+        </w:tc>
+        <w:tc>
+          <w:tcPr/>
+          <w:p>
+            <w:pPr>
+              <w:pStyle w:val="Compact"/>
+              <w:jc w:val="left"/>
+            </w:pPr>
+            <w:r>
+              <w:t xml:space="preserve">一段大于 0 集，否则「生成」按钮置灰并提示「至少要有一段大于 0 集」</w:t>
+            </w:r>
+          </w:p>
+        </w:tc>
+      </w:tr>
+      <w:tr>
+        <w:tc>
+          <w:tcPr/>
+          <w:p>
+            <w:pPr>
+              <w:pStyle w:val="Compact"/>
+              <w:jc w:val="left"/>
+            </w:pPr>
+            <w:r>
+              <w:t xml:space="preserve">很短的段</w:t>
+            </w:r>
+          </w:p>
+        </w:tc>
+        <w:tc>
+          <w:tcPr/>
+          <w:p>
+            <w:pPr>
+              <w:pStyle w:val="Compact"/>
+              <w:jc w:val="left"/>
+            </w:pPr>
+            <w:r>
+              <w:t xml:space="preserve">非 0 且少于 3 集（结局段除外）：琥珀提示「二卡少于 3 集，卡点太密，观众付费意愿可能下降（可以继续）」，不阻止</w:t>
+            </w:r>
+          </w:p>
+        </w:tc>
+      </w:tr>
+      <w:tr>
+        <w:tc>
+          <w:tcPr/>
+          <w:p>
+            <w:pPr>
+              <w:pStyle w:val="Compact"/>
+              <w:jc w:val="left"/>
+            </w:pPr>
+            <w:r>
+              <w:t xml:space="preserve">只写一段</w:t>
+            </w:r>
+          </w:p>
+        </w:tc>
+        <w:tc>
+          <w:tcPr/>
+          <w:p>
+            <w:pPr>
+              <w:pStyle w:val="Compact"/>
+              <w:jc w:val="left"/>
+            </w:pPr>
+            <w:r>
+              <w:t xml:space="preserve">汇总里说明「只写一卡：剧本也只会写这 15 集；第 15 集作为本次的最后一集，结尾停在卡点悬念上」</w:t>
+            </w:r>
+          </w:p>
+        </w:tc>
+      </w:tr>
+      <w:tr>
+        <w:tc>
+          <w:tcPr/>
+          <w:p>
+            <w:pPr>
+              <w:pStyle w:val="Compact"/>
+              <w:jc w:val="left"/>
+            </w:pPr>
+            <w:r>
+              <w:t xml:space="preserve">集数连续</w:t>
+            </w:r>
+          </w:p>
+        </w:tc>
+        <w:tc>
+          <w:tcPr/>
+          <w:p>
+            <w:pPr>
+              <w:pStyle w:val="Compact"/>
+              <w:jc w:val="left"/>
+            </w:pPr>
+            <w:r>
+              <w:t xml:space="preserve">0 集的段不占集号：一卡 15、二卡 0、三卡 10 → 一卡第 1–15 集，三卡第 16–25 集</w:t>
+            </w:r>
+          </w:p>
+        </w:tc>
+      </w:tr>
+    </w:tbl>
+    <w:bookmarkEnd w:id="110"/>
+    <w:bookmarkStart w:id="129" w:name="弹窗交互"/>
+    <w:p>
+      <w:pPr>
+        <w:pStyle w:val="Heading3"/>
+      </w:pPr>
+      <w:r>
+        <w:t xml:space="preserve">4.3 弹窗交互</w:t>
+      </w:r>
+    </w:p>
+    <w:p>
+      <w:pPr>
+        <w:pStyle w:val="CaptionedFigure"/>
+      </w:pPr>
+      <w:r>
+        <w:drawing>
+          <wp:inline>
+            <wp:extent cx="5334000" cy="3333750"/>
+            <wp:effectExtent b="0" l="0" r="0" t="0"/>
+            <wp:docPr descr="卡点分段弹窗（标准四段）" title="" id="112" name="Picture"/>
+            <a:graphic>
+              <a:graphicData uri="http://schemas.openxmlformats.org/drawingml/2006/picture">
+                <pic:pic>
+                  <pic:nvPicPr>
+                    <pic:cNvPr descr="hd-img/c01-modal.jpg" id="113" name="Picture"/>
+                    <pic:cNvPicPr>
+                      <a:picLocks noChangeArrowheads="1" noChangeAspect="1"/>
+                    </pic:cNvPicPr>
+                  </pic:nvPicPr>
+                  <pic:blipFill>
+                    <a:blip r:embed="rId111"/>
+                    <a:stretch>
+                      <a:fillRect/>
+                    </a:stretch>
+                  </pic:blipFill>
+                  <pic:spPr bwMode="auto">
+                    <a:xfrm>
+                      <a:off x="0" y="0"/>
+                      <a:ext cx="5334000" cy="3333750"/>
+                    </a:xfrm>
+                    <a:prstGeom prst="rect">
+                      <a:avLst/>
+                    </a:prstGeom>
+                    <a:noFill/>
+                    <a:ln w="9525">
+                      <a:noFill/>
+                      <a:headEnd/>
+                      <a:tailEnd/>
+                    </a:ln>
+                  </pic:spPr>
+                </pic:pic>
+              </a:graphicData>
+            </a:graphic>
+          </wp:inline>
+        </w:drawing>
+      </w:r>
+    </w:p>
+    <w:p>
+      <w:pPr>
+        <w:pStyle w:val="ImageCaption"/>
+      </w:pPr>
+      <w:r>
+        <w:t xml:space="preserve">卡点分段弹窗（标准四段）</w:t>
+      </w:r>
+    </w:p>
+    <w:tbl>
+      <w:tblPr>
+        <w:tblStyle w:val="Table"/>
+        <w:tblW w:type="pct" w:w="5000"/>
+        <w:tblLook w:firstRow="1" w:lastRow="0" w:firstColumn="0" w:lastColumn="0" w:noHBand="0" w:noVBand="0" w:val="0020"/>
+        <w:jc w:val="start"/>
+      </w:tblPr>
+      <w:tblGrid>
+        <w:gridCol w:w="3960"/>
+        <w:gridCol w:w="3960"/>
+      </w:tblGrid>
+      <w:tr>
+        <w:trPr>
+          <w:tblHeader w:val="true"/>
+        </w:trPr>
+        <w:tc>
+          <w:tcPr/>
+          <w:p>
+            <w:pPr>
+              <w:pStyle w:val="Compact"/>
+              <w:jc w:val="left"/>
+            </w:pPr>
+            <w:r>
+              <w:t xml:space="preserve">区块</w:t>
+            </w:r>
+          </w:p>
+        </w:tc>
+        <w:tc>
+          <w:tcPr/>
+          <w:p>
+            <w:pPr>
+              <w:pStyle w:val="Compact"/>
+              <w:jc w:val="left"/>
+            </w:pPr>
+            <w:r>
+              <w:t xml:space="preserve">交互</w:t>
+            </w:r>
+          </w:p>
+        </w:tc>
+      </w:tr>
+      <w:tr>
+        <w:tc>
+          <w:tcPr/>
+          <w:p>
+            <w:pPr>
+              <w:pStyle w:val="Compact"/>
+              <w:jc w:val="left"/>
+            </w:pPr>
+            <w:r>
+              <w:t xml:space="preserve">生成方式</w:t>
+            </w:r>
+          </w:p>
+        </w:tc>
+        <w:tc>
+          <w:tcPr/>
+          <w:p>
+            <w:pPr>
+              <w:pStyle w:val="Compact"/>
+              <w:jc w:val="left"/>
+            </w:pPr>
+            <w:r>
+              <w:t xml:space="preserve">直接生成全部集纲 / 按卡点分段（推荐，副标题「每段写完给你确认；可以只写其中几段」）</w:t>
+            </w:r>
+          </w:p>
+        </w:tc>
+      </w:tr>
+      <w:tr>
+        <w:tc>
+          <w:tcPr/>
+          <w:p>
+            <w:pPr>
+              <w:pStyle w:val="Compact"/>
+              <w:jc w:val="left"/>
+            </w:pPr>
+            <w:r>
+              <w:t xml:space="preserve">快速选择</w:t>
+            </w:r>
+          </w:p>
+        </w:tc>
+        <w:tc>
+          <w:tcPr/>
+          <w:p>
+            <w:pPr>
+              <w:pStyle w:val="Compact"/>
+              <w:jc w:val="left"/>
+            </w:pPr>
+            <w:r>
+              <w:t xml:space="preserve">标准四段（12 / 23 / 25 / 20）· 只写一卡（15 / 0 / 0 / 0）· 写到二卡（12 / 23 / 0 / 0）· 三卡就结局（12 / 23 / 25 / 0）· 四段平均（20 ×4）；当前分段与某个预设一致时该预设高亮</w:t>
+            </w:r>
+          </w:p>
+        </w:tc>
+      </w:tr>
+      <w:tr>
+        <w:tc>
+          <w:tcPr/>
+          <w:p>
+            <w:pPr>
+              <w:pStyle w:val="Compact"/>
+              <w:jc w:val="left"/>
+            </w:pPr>
+            <w:r>
+              <w:t xml:space="preserve">结构条</w:t>
+            </w:r>
+          </w:p>
+        </w:tc>
+        <w:tc>
+          <w:tcPr/>
+          <w:p>
+            <w:pPr>
+              <w:pStyle w:val="Compact"/>
+              <w:jc w:val="left"/>
+            </w:pPr>
+            <w:r>
+              <w:t xml:space="preserve">四段色块首尾相接，块内写「一卡 / 15 集」；</w:t>
+            </w:r>
+            <w:r>
+              <w:rPr>
+                <w:bCs/>
+                <w:b/>
+              </w:rPr>
+              <w:t xml:space="preserve">拖每段右边的把手改这一段的集数</w:t>
+            </w:r>
+            <w:r>
+              <w:t xml:space="preserve">，后面的段整体后移；拖到和左边把手重合 = 0 集，显示虚线和「二卡、三卡、结局段 0 集」；把手悬停 / 拖动时显示「一卡 · 15 集 · 卡点第 15 集」；键盘 ← → 每次 ±1 集；重合的把手优先拖动靠左的段（方便把 0 集的二卡重新拉出来）；条的刻度至少 40 集，留出拉长的余量</w:t>
+            </w:r>
+          </w:p>
+        </w:tc>
+      </w:tr>
+      <w:tr>
+        <w:tc>
+          <w:tcPr/>
+          <w:p>
+            <w:pPr>
+              <w:pStyle w:val="Compact"/>
+              <w:jc w:val="left"/>
+            </w:pPr>
+            <w:r>
+              <w:t xml:space="preserve">每段卡片</w:t>
+            </w:r>
+          </w:p>
+        </w:tc>
+        <w:tc>
+          <w:tcPr/>
+          <w:p>
+            <w:pPr>
+              <w:pStyle w:val="Compact"/>
+              <w:jc w:val="left"/>
+            </w:pPr>
+            <w:r>
+              <w:t xml:space="preserve">色块 + 段名 +「不写」勾选框；步进器（− / 输入 / +）；滑杆（0–40，更多集数用输入框）；「第 1–15 集 · 卡点在第 15 集」或「0 集 · 不生成」。勾「不写」= 设为 0（卡片变虚线、半透明），取消勾选恢复上次的集数</w:t>
+            </w:r>
+          </w:p>
+        </w:tc>
+      </w:tr>
+      <w:tr>
+        <w:tc>
+          <w:tcPr/>
+          <w:p>
+            <w:pPr>
+              <w:pStyle w:val="Compact"/>
+              <w:jc w:val="left"/>
+            </w:pPr>
+            <w:r>
+              <w:t xml:space="preserve">将生成</w:t>
+            </w:r>
+          </w:p>
+        </w:tc>
+        <w:tc>
+          <w:tcPr/>
+          <w:p>
+            <w:pPr>
+              <w:pStyle w:val="Compact"/>
+              <w:jc w:val="left"/>
+            </w:pPr>
+            <w:r>
+              <w:t xml:space="preserve">列出每个非 0 段：「一卡 第 1–15 集（15 集）· 付费卡点：第 15 集」；0 集的段一行说明「之后可以在左侧目录点「＋ 启用」补上」</w:t>
+            </w:r>
+          </w:p>
+        </w:tc>
+      </w:tr>
+      <w:tr>
+        <w:tc>
+          <w:tcPr/>
+          <w:p>
+            <w:pPr>
+              <w:pStyle w:val="Compact"/>
+              <w:jc w:val="left"/>
+            </w:pPr>
+            <w:r>
+              <w:t xml:space="preserve">每段写完后</w:t>
+            </w:r>
+          </w:p>
+        </w:tc>
+        <w:tc>
+          <w:tcPr/>
+          <w:p>
+            <w:pPr>
+              <w:pStyle w:val="Compact"/>
+              <w:jc w:val="left"/>
+            </w:pPr>
+            <w:r>
+              <w:t xml:space="preserve">停下来让我确认 / 自动接着写（只有 1 段要生成时不显示）</w:t>
+            </w:r>
+          </w:p>
+        </w:tc>
+      </w:tr>
+      <w:tr>
+        <w:tc>
+          <w:tcPr/>
+          <w:p>
+            <w:pPr>
+              <w:pStyle w:val="Compact"/>
+              <w:jc w:val="left"/>
+            </w:pPr>
+            <w:r>
+              <w:t xml:space="preserve">图例</w:t>
+            </w:r>
+          </w:p>
+        </w:tc>
+        <w:tc>
+          <w:tcPr/>
+          <w:p>
+            <w:pPr>
+              <w:pStyle w:val="Compact"/>
+              <w:jc w:val="left"/>
+            </w:pPr>
+            <w:r>
+              <w:t xml:space="preserve">四段颜色 + 「0 集（不生成）」</w:t>
+            </w:r>
+          </w:p>
+        </w:tc>
+      </w:tr>
+      <w:tr>
+        <w:tc>
+          <w:tcPr/>
+          <w:p>
+            <w:pPr>
+              <w:pStyle w:val="Compact"/>
+              <w:jc w:val="left"/>
+            </w:pPr>
+            <w:r>
+              <w:t xml:space="preserve">底部</w:t>
+            </w:r>
+          </w:p>
+        </w:tc>
+        <w:tc>
+          <w:tcPr/>
+          <w:p>
+            <w:pPr>
+              <w:pStyle w:val="Compact"/>
+              <w:jc w:val="left"/>
+            </w:pPr>
+            <w:r>
+              <w:t xml:space="preserve">预计积分（</w:t>
+            </w:r>
+            <w:r>
+              <w:rPr>
+                <w:bCs/>
+                <w:b/>
+              </w:rPr>
+              <w:t xml:space="preserve">只按要生成的段计算</w:t>
+            </w:r>
+            <w:r>
+              <w:t xml:space="preserve">）；按钮文案随结果变化：「生成 4 段集纲」「生成 2 段集纲」「只生成一卡集纲」；直接生成全部时「生成 N 集集纲」</w:t>
+            </w:r>
+          </w:p>
+        </w:tc>
+      </w:tr>
+    </w:tbl>
+    <w:p>
+      <w:pPr>
+        <w:pStyle w:val="CaptionedFigure"/>
+      </w:pPr>
+      <w:r>
+        <w:drawing>
+          <wp:inline>
+            <wp:extent cx="5334000" cy="3333750"/>
+            <wp:effectExtent b="0" l="0" r="0" t="0"/>
+            <wp:docPr descr="拖动把手改集数" title="" id="115" name="Picture"/>
+            <a:graphic>
+              <a:graphicData uri="http://schemas.openxmlformats.org/drawingml/2006/picture">
+                <pic:pic>
+                  <pic:nvPicPr>
+                    <pic:cNvPr descr="hd-img/c02-drag.jpg" id="116" name="Picture"/>
+                    <pic:cNvPicPr>
+                      <a:picLocks noChangeArrowheads="1" noChangeAspect="1"/>
+                    </pic:cNvPicPr>
+                  </pic:nvPicPr>
+                  <pic:blipFill>
+                    <a:blip r:embed="rId114"/>
+                    <a:stretch>
+                      <a:fillRect/>
+                    </a:stretch>
+                  </pic:blipFill>
+                  <pic:spPr bwMode="auto">
+                    <a:xfrm>
+                      <a:off x="0" y="0"/>
+                      <a:ext cx="5334000" cy="3333750"/>
+                    </a:xfrm>
+                    <a:prstGeom prst="rect">
+                      <a:avLst/>
+                    </a:prstGeom>
+                    <a:noFill/>
+                    <a:ln w="9525">
+                      <a:noFill/>
+                      <a:headEnd/>
+                      <a:tailEnd/>
+                    </a:ln>
+                  </pic:spPr>
+                </pic:pic>
+              </a:graphicData>
+            </a:graphic>
+          </wp:inline>
+        </w:drawing>
+      </w:r>
+    </w:p>
+    <w:p>
+      <w:pPr>
+        <w:pStyle w:val="ImageCaption"/>
+      </w:pPr>
+      <w:r>
+        <w:t xml:space="preserve">拖动把手改集数</w:t>
+      </w:r>
+    </w:p>
+    <w:p>
+      <w:pPr>
+        <w:pStyle w:val="CaptionedFigure"/>
+      </w:pPr>
+      <w:r>
+        <w:drawing>
+          <wp:inline>
+            <wp:extent cx="5334000" cy="3333750"/>
+            <wp:effectExtent b="0" l="0" r="0" t="0"/>
+            <wp:docPr descr="把二卡拖成 0 集" title="" id="118" name="Picture"/>
+            <a:graphic>
+              <a:graphicData uri="http://schemas.openxmlformats.org/drawingml/2006/picture">
+                <pic:pic>
+                  <pic:nvPicPr>
+                    <pic:cNvPr descr="hd-img/c03-zero.jpg" id="119" name="Picture"/>
+                    <pic:cNvPicPr>
+                      <a:picLocks noChangeArrowheads="1" noChangeAspect="1"/>
+                    </pic:cNvPicPr>
+                  </pic:nvPicPr>
+                  <pic:blipFill>
+                    <a:blip r:embed="rId117"/>
+                    <a:stretch>
+                      <a:fillRect/>
+                    </a:stretch>
+                  </pic:blipFill>
+                  <pic:spPr bwMode="auto">
+                    <a:xfrm>
+                      <a:off x="0" y="0"/>
+                      <a:ext cx="5334000" cy="3333750"/>
+                    </a:xfrm>
+                    <a:prstGeom prst="rect">
+                      <a:avLst/>
+                    </a:prstGeom>
+                    <a:noFill/>
+                    <a:ln w="9525">
+                      <a:noFill/>
+                      <a:headEnd/>
+                      <a:tailEnd/>
+                    </a:ln>
+                  </pic:spPr>
+                </pic:pic>
+              </a:graphicData>
+            </a:graphic>
+          </wp:inline>
+        </w:drawing>
+      </w:r>
+    </w:p>
+    <w:p>
+      <w:pPr>
+        <w:pStyle w:val="ImageCaption"/>
+      </w:pPr>
+      <w:r>
+        <w:t xml:space="preserve">把二卡拖成 0 集</w:t>
+      </w:r>
+    </w:p>
+    <w:p>
+      <w:pPr>
+        <w:pStyle w:val="CaptionedFigure"/>
+      </w:pPr>
+      <w:r>
+        <w:drawing>
+          <wp:inline>
+            <wp:extent cx="5334000" cy="3333750"/>
+            <wp:effectExtent b="0" l="0" r="0" t="0"/>
+            <wp:docPr descr="只写一卡" title="" id="121" name="Picture"/>
+            <a:graphic>
+              <a:graphicData uri="http://schemas.openxmlformats.org/drawingml/2006/picture">
+                <pic:pic>
+                  <pic:nvPicPr>
+                    <pic:cNvPr descr="hd-img/c04-only-c1.jpg" id="122" name="Picture"/>
+                    <pic:cNvPicPr>
+                      <a:picLocks noChangeArrowheads="1" noChangeAspect="1"/>
+                    </pic:cNvPicPr>
+                  </pic:nvPicPr>
+                  <pic:blipFill>
+                    <a:blip r:embed="rId120"/>
+                    <a:stretch>
+                      <a:fillRect/>
+                    </a:stretch>
+                  </pic:blipFill>
+                  <pic:spPr bwMode="auto">
+                    <a:xfrm>
+                      <a:off x="0" y="0"/>
+                      <a:ext cx="5334000" cy="3333750"/>
+                    </a:xfrm>
+                    <a:prstGeom prst="rect">
+                      <a:avLst/>
+                    </a:prstGeom>
+                    <a:noFill/>
+                    <a:ln w="9525">
+                      <a:noFill/>
+                      <a:headEnd/>
+                      <a:tailEnd/>
+                    </a:ln>
+                  </pic:spPr>
+                </pic:pic>
+              </a:graphicData>
+            </a:graphic>
+          </wp:inline>
+        </w:drawing>
+      </w:r>
+    </w:p>
+    <w:p>
+      <w:pPr>
+        <w:pStyle w:val="ImageCaption"/>
+      </w:pPr>
+      <w:r>
+        <w:t xml:space="preserve">只写一卡</w:t>
+      </w:r>
+    </w:p>
+    <w:p>
+      <w:pPr>
+        <w:pStyle w:val="CaptionedFigure"/>
+      </w:pPr>
+      <w:r>
+        <w:drawing>
+          <wp:inline>
+            <wp:extent cx="5334000" cy="3333750"/>
+            <wp:effectExtent b="0" l="0" r="0" t="0"/>
+            <wp:docPr descr="很短的段：提示但不阻止" title="" id="124" name="Picture"/>
+            <a:graphic>
+              <a:graphicData uri="http://schemas.openxmlformats.org/drawingml/2006/picture">
+                <pic:pic>
+                  <pic:nvPicPr>
+                    <pic:cNvPr descr="hd-img/c05-short-warn.jpg" id="125" name="Picture"/>
+                    <pic:cNvPicPr>
+                      <a:picLocks noChangeArrowheads="1" noChangeAspect="1"/>
+                    </pic:cNvPicPr>
+                  </pic:nvPicPr>
+                  <pic:blipFill>
+                    <a:blip r:embed="rId123"/>
+                    <a:stretch>
+                      <a:fillRect/>
+                    </a:stretch>
+                  </pic:blipFill>
+                  <pic:spPr bwMode="auto">
+                    <a:xfrm>
+                      <a:off x="0" y="0"/>
+                      <a:ext cx="5334000" cy="3333750"/>
+                    </a:xfrm>
+                    <a:prstGeom prst="rect">
+                      <a:avLst/>
+                    </a:prstGeom>
+                    <a:noFill/>
+                    <a:ln w="9525">
+                      <a:noFill/>
+                      <a:headEnd/>
+                      <a:tailEnd/>
+                    </a:ln>
+                  </pic:spPr>
+                </pic:pic>
+              </a:graphicData>
+            </a:graphic>
+          </wp:inline>
+        </w:drawing>
+      </w:r>
+    </w:p>
+    <w:p>
+      <w:pPr>
+        <w:pStyle w:val="ImageCaption"/>
+      </w:pPr>
+      <w:r>
+        <w:t xml:space="preserve">很短的段：提示但不阻止</w:t>
+      </w:r>
+    </w:p>
+    <w:p>
+      <w:pPr>
+        <w:pStyle w:val="CaptionedFigure"/>
+      </w:pPr>
+      <w:r>
+        <w:drawing>
+          <wp:inline>
+            <wp:extent cx="5334000" cy="3333750"/>
+            <wp:effectExtent b="0" l="0" r="0" t="0"/>
+            <wp:docPr descr="全部为 0：不能生成" title="" id="127" name="Picture"/>
+            <a:graphic>
+              <a:graphicData uri="http://schemas.openxmlformats.org/drawingml/2006/picture">
+                <pic:pic>
+                  <pic:nvPicPr>
+                    <pic:cNvPr descr="hd-img/c06-all-zero.jpg" id="128" name="Picture"/>
+                    <pic:cNvPicPr>
+                      <a:picLocks noChangeArrowheads="1" noChangeAspect="1"/>
+                    </pic:cNvPicPr>
+                  </pic:nvPicPr>
+                  <pic:blipFill>
+                    <a:blip r:embed="rId126"/>
+                    <a:stretch>
+                      <a:fillRect/>
+                    </a:stretch>
+                  </pic:blipFill>
+                  <pic:spPr bwMode="auto">
+                    <a:xfrm>
+                      <a:off x="0" y="0"/>
+                      <a:ext cx="5334000" cy="3333750"/>
+                    </a:xfrm>
+                    <a:prstGeom prst="rect">
+                      <a:avLst/>
+                    </a:prstGeom>
+                    <a:noFill/>
+                    <a:ln w="9525">
+                      <a:noFill/>
+                      <a:headEnd/>
+                      <a:tailEnd/>
+                    </a:ln>
+                  </pic:spPr>
+                </pic:pic>
+              </a:graphicData>
+            </a:graphic>
+          </wp:inline>
+        </w:drawing>
+      </w:r>
+    </w:p>
+    <w:p>
+      <w:pPr>
+        <w:pStyle w:val="ImageCaption"/>
+      </w:pPr>
+      <w:r>
+        <w:t xml:space="preserve">全部为 0：不能生成</w:t>
+      </w:r>
+    </w:p>
+    <w:bookmarkEnd w:id="129"/>
+    <w:bookmarkStart w:id="136" w:name="生成之后"/>
+    <w:p>
+      <w:pPr>
+        <w:pStyle w:val="Heading3"/>
+      </w:pPr>
+      <w:r>
+        <w:t xml:space="preserve">4.4 生成之后</w:t>
+      </w:r>
+    </w:p>
+    <w:tbl>
+      <w:tblPr>
+        <w:tblStyle w:val="Table"/>
+        <w:tblW w:type="pct" w:w="5000"/>
+        <w:tblLook w:firstRow="1" w:lastRow="0" w:firstColumn="0" w:lastColumn="0" w:noHBand="0" w:noVBand="0" w:val="0020"/>
+        <w:jc w:val="start"/>
+      </w:tblPr>
+      <w:tblGrid>
+        <w:gridCol w:w="3960"/>
+        <w:gridCol w:w="3960"/>
+      </w:tblGrid>
+      <w:tr>
+        <w:trPr>
+          <w:tblHeader w:val="true"/>
+        </w:trPr>
+        <w:tc>
+          <w:tcPr/>
+          <w:p>
+            <w:pPr>
+              <w:pStyle w:val="Compact"/>
+              <w:jc w:val="left"/>
+            </w:pPr>
+            <w:r>
+              <w:t xml:space="preserve">位置</w:t>
+            </w:r>
+          </w:p>
+        </w:tc>
+        <w:tc>
+          <w:tcPr/>
+          <w:p>
+            <w:pPr>
+              <w:pStyle w:val="Compact"/>
+              <w:jc w:val="left"/>
+            </w:pPr>
+            <w:r>
+              <w:t xml:space="preserve">表现</w:t>
+            </w:r>
+          </w:p>
+        </w:tc>
+      </w:tr>
+      <w:tr>
+        <w:tc>
+          <w:tcPr/>
+          <w:p>
+            <w:pPr>
+              <w:pStyle w:val="Compact"/>
+              <w:jc w:val="left"/>
+            </w:pPr>
+            <w:r>
+              <w:t xml:space="preserve">目录 · 集纲</w:t>
+            </w:r>
+          </w:p>
+        </w:tc>
+        <w:tc>
+          <w:tcPr/>
+          <w:p>
+            <w:pPr>
+              <w:pStyle w:val="Compact"/>
+              <w:jc w:val="left"/>
+            </w:pPr>
+            <w:r>
+              <w:t xml:space="preserve">非 0 段正常显示集数区间和状态；0 集的段半透明显示「二卡 · 0 集 · ＋ 启用」</w:t>
+            </w:r>
+          </w:p>
+        </w:tc>
+      </w:tr>
+      <w:tr>
+        <w:tc>
+          <w:tcPr/>
+          <w:p>
+            <w:pPr>
+              <w:pStyle w:val="Compact"/>
+              <w:jc w:val="left"/>
+            </w:pPr>
+            <w:r>
+              <w:t xml:space="preserve">生成过程</w:t>
+            </w:r>
+          </w:p>
+        </w:tc>
+        <w:tc>
+          <w:tcPr/>
+          <w:p>
+            <w:pPr>
+              <w:pStyle w:val="Compact"/>
+              <w:jc w:val="left"/>
+            </w:pPr>
+            <w:r>
+              <w:t xml:space="preserve">只依次生成非 0 段；AI 助手说明「二卡、三卡、结局段为 0 集，跳过」；精细生成下每段写完停下等确认</w:t>
+            </w:r>
+          </w:p>
+        </w:tc>
+      </w:tr>
+      <w:tr>
+        <w:tc>
+          <w:tcPr/>
+          <w:p>
+            <w:pPr>
+              <w:pStyle w:val="Compact"/>
+              <w:jc w:val="left"/>
+            </w:pPr>
+            <w:r>
+              <w:t xml:space="preserve">剧本</w:t>
+            </w:r>
+          </w:p>
+        </w:tc>
+        <w:tc>
+          <w:tcPr/>
+          <w:p>
+            <w:pPr>
+              <w:pStyle w:val="Compact"/>
+              <w:jc w:val="left"/>
+            </w:pPr>
+            <w:r>
+              <w:t xml:space="preserve">只为已生成的段写剧本；「续写」只在下一段非 0 时出现，否则显示「＋ 启用二卡并续写」</w:t>
+            </w:r>
+          </w:p>
+        </w:tc>
+      </w:tr>
+      <w:tr>
+        <w:tc>
+          <w:tcPr/>
+          <w:p>
+            <w:pPr>
+              <w:pStyle w:val="Compact"/>
+              <w:jc w:val="left"/>
+            </w:pPr>
+            <w:r>
+              <w:t xml:space="preserve">启用</w:t>
+            </w:r>
+          </w:p>
+        </w:tc>
+        <w:tc>
+          <w:tcPr/>
+          <w:p>
+            <w:pPr>
+              <w:pStyle w:val="Compact"/>
+              <w:jc w:val="left"/>
+            </w:pPr>
+            <w:r>
+              <w:t xml:space="preserve">点「＋ 启用」打开同一个弹窗，这一段预填上次的集数（没有则 10 集），确认后只生成新启用的段，已生成的段不动</w:t>
+            </w:r>
+          </w:p>
+        </w:tc>
+      </w:tr>
+      <w:tr>
+        <w:tc>
+          <w:tcPr/>
+          <w:p>
+            <w:pPr>
+              <w:pStyle w:val="Compact"/>
+              <w:jc w:val="left"/>
+            </w:pPr>
+            <w:r>
+              <w:t xml:space="preserve">调整</w:t>
+            </w:r>
+          </w:p>
+        </w:tc>
+        <w:tc>
+          <w:tcPr/>
+          <w:p>
+            <w:pPr>
+              <w:pStyle w:val="Compact"/>
+              <w:jc w:val="left"/>
+            </w:pPr>
+            <w:r>
+              <w:t xml:space="preserve">已生成的段可以改集数（受影响的内容标「待更新」，同全站 6.3）；已定稿的段不能改成 0（提示先「继续编辑」）</w:t>
+            </w:r>
+          </w:p>
+        </w:tc>
+      </w:tr>
+    </w:tbl>
+    <w:p>
+      <w:pPr>
+        <w:pStyle w:val="CaptionedFigure"/>
+      </w:pPr>
+      <w:r>
+        <w:drawing>
+          <wp:inline>
+            <wp:extent cx="5334000" cy="3333750"/>
+            <wp:effectExtent b="0" l="0" r="0" t="0"/>
+            <wp:docPr descr="只生成了一卡" title="" id="131" name="Picture"/>
+            <a:graphic>
+              <a:graphicData uri="http://schemas.openxmlformats.org/drawingml/2006/picture">
+                <pic:pic>
+                  <pic:nvPicPr>
+                    <pic:cNvPr descr="hd-img/c08-done.jpg" id="132" name="Picture"/>
+                    <pic:cNvPicPr>
+                      <a:picLocks noChangeArrowheads="1" noChangeAspect="1"/>
+                    </pic:cNvPicPr>
+                  </pic:nvPicPr>
+                  <pic:blipFill>
+                    <a:blip r:embed="rId130"/>
+                    <a:stretch>
+                      <a:fillRect/>
+                    </a:stretch>
+                  </pic:blipFill>
+                  <pic:spPr bwMode="auto">
+                    <a:xfrm>
+                      <a:off x="0" y="0"/>
+                      <a:ext cx="5334000" cy="3333750"/>
+                    </a:xfrm>
+                    <a:prstGeom prst="rect">
+                      <a:avLst/>
+                    </a:prstGeom>
+                    <a:noFill/>
+                    <a:ln w="9525">
+                      <a:noFill/>
+                      <a:headEnd/>
+                      <a:tailEnd/>
+                    </a:ln>
+                  </pic:spPr>
+                </pic:pic>
+              </a:graphicData>
+            </a:graphic>
+          </wp:inline>
+        </w:drawing>
+      </w:r>
+    </w:p>
+    <w:p>
+      <w:pPr>
+        <w:pStyle w:val="ImageCaption"/>
+      </w:pPr>
+      <w:r>
+        <w:t xml:space="preserve">只生成了一卡</w:t>
+      </w:r>
+    </w:p>
+    <w:p>
+      <w:pPr>
+        <w:pStyle w:val="CaptionedFigure"/>
+      </w:pPr>
+      <w:r>
+        <w:drawing>
+          <wp:inline>
+            <wp:extent cx="5334000" cy="3333750"/>
+            <wp:effectExtent b="0" l="0" r="0" t="0"/>
+            <wp:docPr descr="启用二卡" title="" id="134" name="Picture"/>
+            <a:graphic>
+              <a:graphicData uri="http://schemas.openxmlformats.org/drawingml/2006/picture">
+                <pic:pic>
+                  <pic:nvPicPr>
+                    <pic:cNvPr descr="hd-img/c09-enable.jpg" id="135" name="Picture"/>
+                    <pic:cNvPicPr>
+                      <a:picLocks noChangeArrowheads="1" noChangeAspect="1"/>
+                    </pic:cNvPicPr>
+                  </pic:nvPicPr>
+                  <pic:blipFill>
+                    <a:blip r:embed="rId133"/>
+                    <a:stretch>
+                      <a:fillRect/>
+                    </a:stretch>
+                  </pic:blipFill>
+                  <pic:spPr bwMode="auto">
+                    <a:xfrm>
+                      <a:off x="0" y="0"/>
+                      <a:ext cx="5334000" cy="3333750"/>
+                    </a:xfrm>
+                    <a:prstGeom prst="rect">
+                      <a:avLst/>
+                    </a:prstGeom>
+                    <a:noFill/>
+                    <a:ln w="9525">
+                      <a:noFill/>
+                      <a:headEnd/>
+                      <a:tailEnd/>
+                    </a:ln>
+                  </pic:spPr>
+                </pic:pic>
+              </a:graphicData>
+            </a:graphic>
+          </wp:inline>
+        </w:drawing>
+      </w:r>
+    </w:p>
+    <w:p>
+      <w:pPr>
+        <w:pStyle w:val="ImageCaption"/>
+      </w:pPr>
+      <w:r>
+        <w:t xml:space="preserve">启用二卡</w:t>
+      </w:r>
+    </w:p>
+    <w:bookmarkEnd w:id="136"/>
+    <w:bookmarkStart w:id="137" w:name="可视化"/>
+    <w:p>
+      <w:pPr>
+        <w:pStyle w:val="Heading3"/>
+      </w:pPr>
+      <w:r>
+        <w:t xml:space="preserve">4.5 可视化</w:t>
+      </w:r>
+    </w:p>
+    <w:p>
+      <w:pPr>
+        <w:pStyle w:val="FirstParagraph"/>
+      </w:pPr>
+      <w:r>
+        <w:t xml:space="preserve">四段颜色是一组按身份区分的颜色（蓝 / 橙 / 绿 / 黄），已通过色盲安全校验；色块内、卡片里、汇总里都同时写段名，不只靠颜色区分。</w:t>
+      </w:r>
+    </w:p>
+    <w:bookmarkEnd w:id="137"/>
+    <w:bookmarkStart w:id="138" w:name="验收标准-1"/>
+    <w:p>
+      <w:pPr>
+        <w:pStyle w:val="Heading3"/>
+      </w:pPr>
+      <w:r>
+        <w:t xml:space="preserve">4.6 验收标准</w:t>
+      </w:r>
+    </w:p>
+    <w:p>
+      <w:pPr>
+        <w:numPr>
+          <w:ilvl w:val="0"/>
+          <w:numId w:val="1007"/>
+        </w:numPr>
+        <w:pStyle w:val="Compact"/>
+      </w:pPr>
+      <w:r>
+        <w:t xml:space="preserve">一卡拖到 15、其他段勾「不写」，按钮变为「只生成一卡集纲」，生成后目录只有一卡有内容，其他段显示「＋ 启用」。</w:t>
+      </w:r>
+    </w:p>
+    <w:p>
+      <w:pPr>
+        <w:numPr>
+          <w:ilvl w:val="0"/>
+          <w:numId w:val="1007"/>
+        </w:numPr>
+        <w:pStyle w:val="Compact"/>
+      </w:pPr>
+      <w:r>
+        <w:t xml:space="preserve">二卡设为 0、三卡 10：三卡集号接在一卡后面。</w:t>
+      </w:r>
+    </w:p>
+    <w:p>
+      <w:pPr>
+        <w:numPr>
+          <w:ilvl w:val="0"/>
+          <w:numId w:val="1007"/>
+        </w:numPr>
+        <w:pStyle w:val="Compact"/>
+      </w:pPr>
+      <w:r>
+        <w:t xml:space="preserve">所有段为 0：按钮置灰并提示。</w:t>
+      </w:r>
+    </w:p>
+    <w:p>
+      <w:pPr>
+        <w:numPr>
+          <w:ilvl w:val="0"/>
+          <w:numId w:val="1007"/>
+        </w:numPr>
+        <w:pStyle w:val="Compact"/>
+      </w:pPr>
+      <w:r>
+        <w:t xml:space="preserve">拖动把手时总集数实时变化，悬停 / 拖动显示段名、集数和卡点集。</w:t>
+      </w:r>
+    </w:p>
+    <w:p>
+      <w:pPr>
+        <w:numPr>
+          <w:ilvl w:val="0"/>
+          <w:numId w:val="1007"/>
+        </w:numPr>
+        <w:pStyle w:val="Compact"/>
+      </w:pPr>
+      <w:r>
+        <w:t xml:space="preserve">预计积分只按非 0 段计算。</w:t>
+      </w:r>
+    </w:p>
+    <w:p>
+      <w:r>
+        <w:pict>
+          <v:rect style="width:0;height:1.5pt" o:hralign="center" o:hrstd="t" o:hr="t"/>
+        </w:pict>
+      </w:r>
+    </w:p>
+    <w:bookmarkEnd w:id="138"/>
+    <w:bookmarkEnd w:id="139"/>
+    <w:bookmarkStart w:id="140" w:name="附录demo-使用说明"/>
     <w:p>
       <w:pPr>
         <w:pStyle w:val="Heading2"/>
@@ -5672,7 +7043,7 @@
         <w:t xml:space="preserve"> </w:t>
       </w:r>
       <w:r>
-        <w:t xml:space="preserve">- 点右上角「剧本医生」开始体检；在「总览 / 逐集 / 问题」间切换；悬停曲线和热力图看提示，点击定位。</w:t>
+        <w:t xml:space="preserve">- 点文档标题行右侧的「剧本医生」开始体检；在「总览 / 逐集 / 问题」间切换；悬停曲线和热力图看提示，点击定位。</w:t>
       </w:r>
       <w:r>
         <w:t xml:space="preserve"> </w:t>
@@ -5687,8 +7058,40 @@
         <w:t xml:space="preserve">- Demo 的评分和修改是规则模拟，正式版由模型完成。</w:t>
       </w:r>
     </w:p>
-    <w:bookmarkEnd w:id="109"/>
-    <w:bookmarkEnd w:id="110"/>
+    <w:p>
+      <w:pPr>
+        <w:pStyle w:val="BodyText"/>
+      </w:pPr>
+      <w:r>
+        <w:rPr>
+          <w:rStyle w:val="VerbatimChar"/>
+          <w:bCs/>
+          <w:b/>
+        </w:rPr>
+        <w:t xml:space="preserve">demo/cards.html</w:t>
+      </w:r>
+      <w:r>
+        <w:rPr>
+          <w:bCs/>
+          <w:b/>
+        </w:rPr>
+        <w:t xml:space="preserve">（卡点分段）</w:t>
+      </w:r>
+      <w:r>
+        <w:t xml:space="preserve"> </w:t>
+      </w:r>
+      <w:r>
+        <w:t xml:space="preserve">- 打开即是卡点弹窗。拖色块右边的白色把手、用步进器 / 滑杆、勾「不写」，或点快速选择「只写一卡」。</w:t>
+      </w:r>
+      <w:r>
+        <w:t xml:space="preserve"> </w:t>
+      </w:r>
+      <w:r>
+        <w:t xml:space="preserve">- 点生成后看左侧目录：0 集的段显示「＋ 启用」，点它再加回来。</w:t>
+      </w:r>
+    </w:p>
+    <w:bookmarkEnd w:id="140"/>
+    <w:bookmarkEnd w:id="141"/>
     <w:sectPr/>
   </w:body>
 </w:document>
@@ -5975,6 +7378,36 @@
     <w:abstractNumId w:val="991"/>
   </w:num>
   <w:num w:numId="1006">
+    <w:abstractNumId w:val="99411"/>
+    <w:lvlOverride w:ilvl="0">
+      <w:startOverride w:val="1"/>
+    </w:lvlOverride>
+    <w:lvlOverride w:ilvl="1">
+      <w:startOverride w:val="1"/>
+    </w:lvlOverride>
+    <w:lvlOverride w:ilvl="2">
+      <w:startOverride w:val="1"/>
+    </w:lvlOverride>
+    <w:lvlOverride w:ilvl="3">
+      <w:startOverride w:val="1"/>
+    </w:lvlOverride>
+    <w:lvlOverride w:ilvl="4">
+      <w:startOverride w:val="1"/>
+    </w:lvlOverride>
+    <w:lvlOverride w:ilvl="5">
+      <w:startOverride w:val="1"/>
+    </w:lvlOverride>
+    <w:lvlOverride w:ilvl="6">
+      <w:startOverride w:val="1"/>
+    </w:lvlOverride>
+    <w:lvlOverride w:ilvl="7">
+      <w:startOverride w:val="1"/>
+    </w:lvlOverride>
+    <w:lvlOverride w:ilvl="8">
+      <w:startOverride w:val="1"/>
+    </w:lvlOverride>
+  </w:num>
+  <w:num w:numId="1007">
     <w:abstractNumId w:val="99411"/>
     <w:lvlOverride w:ilvl="0">
       <w:startOverride w:val="1"/>

</xml_diff>